<commit_message>
Added paper name and table to polymers sheet
</commit_message>
<xml_diff>
--- a/paper/Paper Draft.docx
+++ b/paper/Paper Draft.docx
@@ -519,7 +519,21 @@
         <w:rPr>
           <w:rFonts w:ascii="Lucida Bright" w:eastAsiaTheme="minorEastAsia" w:hAnsi="Lucida Bright"/>
         </w:rPr>
-        <w:t xml:space="preserve"> the Flory coefficient with the letter b, whilst Voorter et al use the character v </w:t>
+        <w:t xml:space="preserve"> the Flory coefficient with the letter b, whilst </w:t>
+      </w:r>
+      <w:proofErr w:type="spellStart"/>
+      <w:r>
+        <w:rPr>
+          <w:rFonts w:ascii="Lucida Bright" w:eastAsiaTheme="minorEastAsia" w:hAnsi="Lucida Bright"/>
+        </w:rPr>
+        <w:t>Voorter</w:t>
+      </w:r>
+      <w:proofErr w:type="spellEnd"/>
+      <w:r>
+        <w:rPr>
+          <w:rFonts w:ascii="Lucida Bright" w:eastAsiaTheme="minorEastAsia" w:hAnsi="Lucida Bright"/>
+        </w:rPr>
+        <w:t xml:space="preserve"> et al use the character v </w:t>
       </w:r>
       <w:sdt>
         <w:sdtPr>
@@ -718,7 +732,21 @@
         <w:rPr>
           <w:rFonts w:ascii="Lucida Bright" w:eastAsiaTheme="minorEastAsia" w:hAnsi="Lucida Bright"/>
         </w:rPr>
-        <w:t xml:space="preserve"> (which sometimes requires mathematical manipulation to retrieve the desired numerics). </w:t>
+        <w:t xml:space="preserve"> (which sometimes requires mathematical manipulation to retrieve the desired </w:t>
+      </w:r>
+      <w:proofErr w:type="spellStart"/>
+      <w:r>
+        <w:rPr>
+          <w:rFonts w:ascii="Lucida Bright" w:eastAsiaTheme="minorEastAsia" w:hAnsi="Lucida Bright"/>
+        </w:rPr>
+        <w:t>numerics</w:t>
+      </w:r>
+      <w:proofErr w:type="spellEnd"/>
+      <w:r>
+        <w:rPr>
+          <w:rFonts w:ascii="Lucida Bright" w:eastAsiaTheme="minorEastAsia" w:hAnsi="Lucida Bright"/>
+        </w:rPr>
+        <w:t xml:space="preserve">). </w:t>
       </w:r>
       <w:r>
         <w:rPr>
@@ -726,12 +754,14 @@
         </w:rPr>
         <w:t xml:space="preserve">Some tabulated data store very closely related, but different, quantities next to each other. In the case of </w:t>
       </w:r>
+      <w:proofErr w:type="spellStart"/>
       <w:r>
         <w:rPr>
           <w:rFonts w:ascii="Lucida Bright" w:eastAsiaTheme="minorEastAsia" w:hAnsi="Lucida Bright"/>
         </w:rPr>
         <w:t>Voorter</w:t>
       </w:r>
+      <w:proofErr w:type="spellEnd"/>
       <w:r>
         <w:rPr>
           <w:rFonts w:ascii="Lucida Bright" w:eastAsiaTheme="minorEastAsia" w:hAnsi="Lucida Bright"/>
@@ -813,6 +843,230 @@
           <w:rFonts w:ascii="Lucida Bright" w:eastAsiaTheme="minorEastAsia" w:hAnsi="Lucida Bright"/>
         </w:rPr>
         <w:t xml:space="preserve">Recent advances in agentic Large Language Models (LLMs) have proven themselves </w:t>
+      </w:r>
+      <w:r>
+        <w:rPr>
+          <w:rFonts w:ascii="Lucida Bright" w:eastAsiaTheme="minorEastAsia" w:hAnsi="Lucida Bright"/>
+        </w:rPr>
+        <w:t xml:space="preserve">to be careful interpreters of information and users of tools. Frontier models are now capable of in-depth reasoning and logical deduction, with extremely few errors. Agentic models in particular are engineered to solve problems using a “chain-of-thought” structure, where the model is able to produce output text which it feed back to itself to continue it’s reasoning. This approach dramatically improves the reasoning capabilities of the model by allowing it to break problems up and experiment by pondering multiple approaches to answer the prompt. </w:t>
+      </w:r>
+    </w:p>
+    <w:p>
+      <w:pPr>
+        <w:rPr>
+          <w:rFonts w:ascii="Lucida Bright" w:eastAsiaTheme="minorEastAsia" w:hAnsi="Lucida Bright"/>
+        </w:rPr>
+      </w:pPr>
+      <w:r>
+        <w:rPr>
+          <w:rFonts w:ascii="Lucida Bright" w:eastAsiaTheme="minorEastAsia" w:hAnsi="Lucida Bright"/>
+        </w:rPr>
+        <w:t xml:space="preserve">We are reaching a point where there is little reason to expect the best models to be incapable of understanding even the most technical research. Given the correct requests and compute access, researchers have started solving open problem that </w:t>
+      </w:r>
+      <w:r>
+        <w:rPr>
+          <w:rFonts w:ascii="Lucida Bright" w:eastAsiaTheme="minorEastAsia" w:hAnsi="Lucida Bright"/>
+        </w:rPr>
+        <w:lastRenderedPageBreak/>
+        <w:t xml:space="preserve">have stumped mathematicians for decades, such as the proof due to OpenAI of the </w:t>
+      </w:r>
+      <w:r>
+        <w:rPr>
+          <w:rFonts w:ascii="Lucida Bright" w:eastAsiaTheme="minorEastAsia" w:hAnsi="Lucida Bright"/>
+        </w:rPr>
+        <w:t>Erd</w:t>
+      </w:r>
+      <w:r>
+        <w:rPr>
+          <w:rFonts w:ascii="Cambria" w:eastAsiaTheme="minorEastAsia" w:hAnsi="Cambria" w:cs="Cambria"/>
+        </w:rPr>
+        <w:t>ő</w:t>
+      </w:r>
+      <w:r>
+        <w:rPr>
+          <w:rFonts w:ascii="Lucida Bright" w:eastAsiaTheme="minorEastAsia" w:hAnsi="Lucida Bright"/>
+        </w:rPr>
+        <w:t>s</w:t>
+      </w:r>
+      <w:r>
+        <w:rPr>
+          <w:rFonts w:ascii="Lucida Bright" w:eastAsiaTheme="minorEastAsia" w:hAnsi="Lucida Bright"/>
+        </w:rPr>
+        <w:t xml:space="preserve"> unit distance problem, first proposed in 1946 </w:t>
+      </w:r>
+      <w:sdt>
+        <w:sdtPr>
+          <w:rPr>
+            <w:rFonts w:ascii="Lucida Bright" w:eastAsiaTheme="minorEastAsia" w:hAnsi="Lucida Bright"/>
+          </w:rPr>
+          <w:id w:val="-1433580822"/>
+          <w:citation/>
+        </w:sdtPr>
+        <w:sdtContent>
+          <w:r>
+            <w:rPr>
+              <w:rFonts w:ascii="Lucida Bright" w:eastAsiaTheme="minorEastAsia" w:hAnsi="Lucida Bright"/>
+            </w:rPr>
+            <w:fldChar w:fldCharType="begin"/>
+          </w:r>
+          <w:r>
+            <w:rPr>
+              <w:rFonts w:ascii="Lucida Bright" w:eastAsiaTheme="minorEastAsia" w:hAnsi="Lucida Bright"/>
+            </w:rPr>
+            <w:instrText xml:space="preserve"> CITATION Ope26 \l 2057 </w:instrText>
+          </w:r>
+          <w:r>
+            <w:rPr>
+              <w:rFonts w:ascii="Lucida Bright" w:eastAsiaTheme="minorEastAsia" w:hAnsi="Lucida Bright"/>
+            </w:rPr>
+            <w:fldChar w:fldCharType="separate"/>
+          </w:r>
+          <w:r>
+            <w:rPr>
+              <w:rFonts w:ascii="Lucida Bright" w:eastAsiaTheme="minorEastAsia" w:hAnsi="Lucida Bright"/>
+              <w:noProof/>
+            </w:rPr>
+            <w:t>[8]</w:t>
+          </w:r>
+          <w:r>
+            <w:rPr>
+              <w:rFonts w:ascii="Lucida Bright" w:eastAsiaTheme="minorEastAsia" w:hAnsi="Lucida Bright"/>
+            </w:rPr>
+            <w:fldChar w:fldCharType="end"/>
+          </w:r>
+        </w:sdtContent>
+      </w:sdt>
+      <w:r>
+        <w:rPr>
+          <w:rFonts w:ascii="Lucida Bright" w:eastAsiaTheme="minorEastAsia" w:hAnsi="Lucida Bright"/>
+        </w:rPr>
+        <w:t>. The problem then becomes how do we create the infrastructure and systems required to successfully utilise LLMs in order to create robust, error free and extensive datasets from the existing scientific knowledge. LLMs undoubtfully have the domain knowledge to correctly interpret scientific papers, and do not face issues of tiredness and impatience that a human researcher may face.</w:t>
+      </w:r>
+    </w:p>
+    <w:p>
+      <w:pPr>
+        <w:rPr>
+          <w:rFonts w:ascii="Lucida Bright" w:eastAsiaTheme="minorEastAsia" w:hAnsi="Lucida Bright"/>
+        </w:rPr>
+      </w:pPr>
+      <w:r>
+        <w:rPr>
+          <w:rFonts w:ascii="Lucida Bright" w:eastAsiaTheme="minorEastAsia" w:hAnsi="Lucida Bright"/>
+        </w:rPr>
+        <w:t>Access to the frontier models, however, is extremely excusive. LLMs contain tens of billions to tri</w:t>
+      </w:r>
+      <w:r>
+        <w:rPr>
+          <w:rFonts w:ascii="Lucida Bright" w:eastAsiaTheme="minorEastAsia" w:hAnsi="Lucida Bright"/>
+        </w:rPr>
+        <w:t xml:space="preserve">llions of parameters, which require expensive hardware </w:t>
+      </w:r>
+      <w:r>
+        <w:rPr>
+          <w:rFonts w:ascii="Lucida Bright" w:eastAsiaTheme="minorEastAsia" w:hAnsi="Lucida Bright"/>
+        </w:rPr>
+        <w:t>and large-scale investment into the infrastructure to run them</w:t>
+      </w:r>
+      <w:r>
+        <w:rPr>
+          <w:rFonts w:ascii="Lucida Bright" w:eastAsiaTheme="minorEastAsia" w:hAnsi="Lucida Bright"/>
+        </w:rPr>
+        <w:t xml:space="preserve">. Only a few companies in the world have the facilities to run these models, hence most AI researchers must purchase </w:t>
+      </w:r>
+      <w:r>
+        <w:rPr>
+          <w:rFonts w:ascii="Lucida Bright" w:eastAsiaTheme="minorEastAsia" w:hAnsi="Lucida Bright"/>
+        </w:rPr>
+        <w:t>compute from these companies via an Application Program Interface (API). Thus, the aspect of cost comes into any discussion of the construction of AI-enabled software. It is important to keep in mind the spectrum of access to funding and hardware that researche</w:t>
+      </w:r>
+      <w:r>
+        <w:rPr>
+          <w:rFonts w:ascii="Lucida Bright" w:eastAsiaTheme="minorEastAsia" w:hAnsi="Lucida Bright"/>
+        </w:rPr>
+        <w:t>r</w:t>
+      </w:r>
+      <w:r>
+        <w:rPr>
+          <w:rFonts w:ascii="Lucida Bright" w:eastAsiaTheme="minorEastAsia" w:hAnsi="Lucida Bright"/>
+        </w:rPr>
+        <w:t>s may have when developing tools that are intended to assist them</w:t>
+      </w:r>
+      <w:r>
+        <w:rPr>
+          <w:rFonts w:ascii="Lucida Bright" w:eastAsiaTheme="minorEastAsia" w:hAnsi="Lucida Bright"/>
+        </w:rPr>
+        <w:t>. Indeed, it is</w:t>
+      </w:r>
+      <w:r>
+        <w:rPr>
+          <w:rFonts w:ascii="Lucida Bright" w:eastAsiaTheme="minorEastAsia" w:hAnsi="Lucida Bright"/>
+        </w:rPr>
+        <w:t xml:space="preserve"> possible to run open-weight models locally, </w:t>
+      </w:r>
+      <w:r>
+        <w:rPr>
+          <w:rFonts w:ascii="Lucida Bright" w:eastAsiaTheme="minorEastAsia" w:hAnsi="Lucida Bright"/>
+        </w:rPr>
+        <w:t>on moderately capable hardware, such as NVIDIAs A100 graphics, which is what we targeted with this piece of software.</w:t>
+      </w:r>
+    </w:p>
+    <w:p>
+      <w:pPr>
+        <w:rPr>
+          <w:rFonts w:ascii="Lucida Bright" w:eastAsiaTheme="minorEastAsia" w:hAnsi="Lucida Bright"/>
+        </w:rPr>
+      </w:pPr>
+      <w:r>
+        <w:rPr>
+          <w:rFonts w:ascii="Lucida Bright" w:eastAsiaTheme="minorEastAsia" w:hAnsi="Lucida Bright"/>
+        </w:rPr>
+        <w:t>In this paper, we introduce “</w:t>
+      </w:r>
+      <w:proofErr w:type="spellStart"/>
+      <w:r>
+        <w:rPr>
+          <w:rFonts w:ascii="Lucida Bright" w:eastAsiaTheme="minorEastAsia" w:hAnsi="Lucida Bright"/>
+        </w:rPr>
+        <w:t>chemstractor</w:t>
+      </w:r>
+      <w:proofErr w:type="spellEnd"/>
+      <w:r>
+        <w:rPr>
+          <w:rFonts w:ascii="Lucida Bright" w:eastAsiaTheme="minorEastAsia" w:hAnsi="Lucida Bright"/>
+        </w:rPr>
+        <w:t xml:space="preserve">”, an LLM-driven pipeline for extracting the chemical diffusion coefficients for polymers from scientific literature. We will demonstrate the techniques used in this software, </w:t>
+      </w:r>
+      <w:r>
+        <w:rPr>
+          <w:rFonts w:ascii="Lucida Bright" w:eastAsiaTheme="minorEastAsia" w:hAnsi="Lucida Bright"/>
+        </w:rPr>
+        <w:t xml:space="preserve">detail </w:t>
+      </w:r>
+      <w:r>
+        <w:rPr>
+          <w:rFonts w:ascii="Lucida Bright" w:eastAsiaTheme="minorEastAsia" w:hAnsi="Lucida Bright"/>
+        </w:rPr>
+        <w:t>each of it</w:t>
+      </w:r>
+      <w:proofErr w:type="spellStart"/>
+      <w:r>
+        <w:rPr>
+          <w:rFonts w:ascii="Lucida Bright" w:eastAsiaTheme="minorEastAsia" w:hAnsi="Lucida Bright"/>
+        </w:rPr>
+        <w:t>’s</w:t>
+      </w:r>
+      <w:proofErr w:type="spellEnd"/>
+      <w:r>
+        <w:rPr>
+          <w:rFonts w:ascii="Lucida Bright" w:eastAsiaTheme="minorEastAsia" w:hAnsi="Lucida Bright"/>
+        </w:rPr>
+        <w:t xml:space="preserve"> stages, comment on the results and how </w:t>
+      </w:r>
+      <w:r>
+        <w:rPr>
+          <w:rFonts w:ascii="Lucida Bright" w:eastAsiaTheme="minorEastAsia" w:hAnsi="Lucida Bright"/>
+        </w:rPr>
+        <w:t xml:space="preserve">they can be generalised to produce tools that reliably extract and process different types of technical data. </w:t>
       </w:r>
     </w:p>
     <w:sectPr>
@@ -2365,11 +2619,31 @@
     <b:Issue>20</b:Issue>
     <b:RefOrder>7</b:RefOrder>
   </b:Source>
+  <b:Source>
+    <b:Tag>Ope26</b:Tag>
+    <b:SourceType>InternetSite</b:SourceType>
+    <b:Guid>{5E98A7AB-2B58-4B1A-A467-2715BEC8F97F}</b:Guid>
+    <b:Title>OpenAI</b:Title>
+    <b:Year>2026</b:Year>
+    <b:Author>
+      <b:Author>
+        <b:Corporate>OpenAI</b:Corporate>
+      </b:Author>
+    </b:Author>
+    <b:ProductionCompany>OpenAI</b:ProductionCompany>
+    <b:Month>May</b:Month>
+    <b:Day>20</b:Day>
+    <b:YearAccessed>2026</b:YearAccessed>
+    <b:MonthAccessed>July</b:MonthAccessed>
+    <b:DayAccessed>29</b:DayAccessed>
+    <b:URL>https://openai.com/index/model-disproves-discrete-geometry-conjecture/</b:URL>
+    <b:RefOrder>8</b:RefOrder>
+  </b:Source>
 </b:Sources>
 </file>
 
 <file path=customXml/itemProps1.xml><?xml version="1.0" encoding="utf-8"?>
-<ds:datastoreItem xmlns:ds="http://schemas.openxmlformats.org/officeDocument/2006/customXml" ds:itemID="{69137EC2-3B7A-4008-85E8-8096DE3C4C2E}">
+<ds:datastoreItem xmlns:ds="http://schemas.openxmlformats.org/officeDocument/2006/customXml" ds:itemID="{D16B5843-E846-498C-86A0-83E545726CCB}">
   <ds:schemaRefs>
     <ds:schemaRef ds:uri="http://schemas.openxmlformats.org/officeDocument/2006/bibliography"/>
   </ds:schemaRefs>

</xml_diff>